<commit_message>
Update HLD/LLD/demo PPT with Front Door WebSocket fix
- HLD.docx: Section 6.1 notes the new CMD flags; Section 6.4 documents
  the Front Door WebSocket origin-mismatch issue and its resolution;
  new Section 9.6 covers the CORS/XSRF relaxation as a deliberate,
  documented security trade-off.
- LLD.docx: Section 9.1's Dockerfile table reflects the updated CMD;
  new Section 9.4 is a full diagnosis writeup (symptom, 4-step
  diagnosis via curl/WebSocket-test/Playwright/container-logs, root
  cause, the AFD-side fix attempted first and why it wasn't used, and
  the fix that shipped) -- preserved as reference material per the
  LLD's purpose (module/troubleshooting detail "for further
  reference").
- QuickLoan_Demo.pptx: added a bullet to the deployment slide.
</commit_message>
<xml_diff>
--- a/docs/HLD.docx
+++ b/docs/HLD.docx
@@ -1490,6 +1490,14 @@
     </w:p>
     <w:p>
       <w:pPr>
+        <w:pStyle w:val="ListBullet"/>
+      </w:pPr>
+      <w:r>
+        <w:t>Streamlit is launched with --server.enableCORS=false and --server.enableXsrfProtection=false — required for the app to function behind Azure Front Door (see Section 6.4) and discussed as a deliberate security trade-off in Section 9.6.</w:t>
+      </w:r>
+    </w:p>
+    <w:p>
+      <w:pPr>
         <w:pStyle w:val="Heading2"/>
       </w:pPr>
       <w:r>
@@ -1525,6 +1533,11 @@
     <w:p>
       <w:r>
         <w:t>ACI alone only serves plain HTTP; Front Door sits in front of it as a managed HTTPS edge, providing a free, auto-provisioned TLS certificate on its own *.azurefd.net domain, redirecting any HTTP request to HTTPS, and proxying (HttpOnly) to the ACI origin on port 80. This is what allows the application to be reached at a plain https:// URL with no port number and no certificate management.</w:t>
+      </w:r>
+    </w:p>
+    <w:p>
+      <w:r>
+        <w:t>Post-deployment issue and fix: the app initially loaded a blank page / infinite spinner through the Front Door URL while working correctly via the direct ACI URL. Root cause, confirmed via container logs: Streamlit's WebSocket handler rejects any connection where the browser's Origin header doesn't match its own notion of Host (a built-in anti cross-site-WebSocket-hijacking protection) — since Front Door's public hostname (*.azurefd.net) differs from the origin hostname it forwards as Host, every WebSocket the UI depends on was silently rejected, even though plain HTTP page loads succeeded (no origin check applies there). Pointing the origin's Host header at Front Door's own domain was tried first but depended on AFD edge propagation that took 10+ minutes with no reliable way to confirm completion. The fix that shipped instead relaxes the check at the Streamlit level (--server.enableCORS=false --server.enableXsrfProtection=false, see Section 6.1 and Section 9.6) — unconditional, independent of whatever Host header any proxy in front of it forwards.</w:t>
       </w:r>
     </w:p>
     <w:p>
@@ -2660,6 +2673,19 @@
       </w:r>
     </w:p>
     <w:p>
+      <w:pPr>
+        <w:pStyle w:val="Heading2"/>
+      </w:pPr>
+      <w:r>
+        <w:t>9.6 CORS / XSRF Relaxation (Deployment Trade-off)</w:t>
+      </w:r>
+    </w:p>
+    <w:p>
+      <w:r>
+        <w:t>Streamlit is launched with --server.enableCORS=false and --server.enableXsrfProtection=false (see Section 6.4 for why). This deliberately relaxes two of Streamlit's built-in protections: cross-origin request blocking and CSRF token checks on its internal endpoints. Accepted as a reasonable trade-off here because (a) the ACI origin is already directly reachable over plain HTTP regardless of this setting — Front Door is not the only path to the app — and (b) this is a demo/course deployment, not one handling real customer financial transactions. A production deployment fronted by a single, unchanging proxy hostname could instead solve this by keeping the origin's Host header aligned with that hostname, avoiding the relaxation entirely.</w:t>
+      </w:r>
+    </w:p>
+    <w:p>
       <w:r>
         <w:br w:type="page"/>
       </w:r>

</xml_diff>